<commit_message>
Note Fall registration urgency (classes start Aug 24) and Ximena Lainez follow-up on the Mentoring Plan Hold
Co-Authored-By: Claude Sonnet 5 <noreply@anthropic.com>
Claude-Session: https://claude.ai/code/session_019uQWfMoV11me5yJ6LYRtPv
</commit_message>
<xml_diff>
--- a/dba/00_Execution/UGS_Mentoring_Plan_Hold_2026-07-21.docx
+++ b/dba/00_Execution/UGS_Mentoring_Plan_Hold_2026-07-21.docx
@@ -121,6 +121,37 @@
         <w:pStyle w:val="Heading2"/>
       </w:pPr>
       <w:r>
+        <w:t>Stakes — why this is now urgent</w:t>
+      </w:r>
+    </w:p>
+    <w:p>
+      <w:r>
+        <w:t xml:space="preserve">Fall registration opened per registrar email received 07/13/2026 (classes begin Aug 24, 2026). Registrar's own notice instructs students to "confirm you have cleared any pending items or holds on your To-Do List" before registering — this hold is exactly that kind of blocker. Registrar notice also directs graduate students to their </w:t>
+      </w:r>
+      <w:r>
+        <w:rPr>
+          <w:b/>
+        </w:rPr>
+        <w:t>program coordinator</w:t>
+      </w:r>
+      <w:r>
+        <w:t xml:space="preserve">: forwarded to </w:t>
+      </w:r>
+      <w:r>
+        <w:rPr>
+          <w:b/>
+        </w:rPr>
+        <w:t>Ximena Lainez</w:t>
+      </w:r>
+      <w:r>
+        <w:t xml:space="preserve"> (likely DBA program coordinator) 07/13/2026; specific follow-up naming the Mentoring Plan Hold sent 07/21/2026 asking if she can expedite on the program side.</w:t>
+      </w:r>
+    </w:p>
+    <w:p>
+      <w:pPr>
+        <w:pStyle w:val="Heading2"/>
+      </w:pPr>
+      <w:r>
         <w:t>Still needed</w:t>
       </w:r>
     </w:p>
@@ -130,6 +161,14 @@
       </w:pPr>
       <w:r>
         <w:t>[ ] UGS response on how to access the current-year form.</w:t>
+      </w:r>
+    </w:p>
+    <w:p>
+      <w:pPr>
+        <w:pStyle w:val="ListBullet"/>
+      </w:pPr>
+      <w:r>
+        <w:t>[ ] Ximena Lainez response — can program office expedite, or is this purely a UGS-side fix?</w:t>
       </w:r>
     </w:p>
     <w:p>
@@ -163,6 +202,14 @@
       </w:pPr>
       <w:r>
         <w:t>[ ] Confirm hold clears once the evaluation is submitted/approved — ask UGS directly whether submission alone clears it or full approval is required.</w:t>
+      </w:r>
+    </w:p>
+    <w:p>
+      <w:pPr>
+        <w:pStyle w:val="ListBullet"/>
+      </w:pPr>
+      <w:r>
+        <w:t>[ ] Confirm Fall registration is not blocked before the add/drop window matters.</w:t>
       </w:r>
     </w:p>
     <w:sectPr>

</xml_diff>